<commit_message>
Bordered info table, blue headings, justified layout; fit to 2-page limit
</commit_message>
<xml_diff>
--- a/reference-compact.docx
+++ b/reference-compact.docx
@@ -485,13 +485,15 @@
   <w:docDefaults>
     <w:rPrDefault>
       <w:rPr>
+        <w:rFonts w:ascii="Calibri" w:hAnsi="Calibri"/>
         <w:sz w:val="18"/>
         <w:szCs w:val="18"/>
       </w:rPr>
     </w:rPrDefault>
     <w:pPrDefault>
       <w:pPr>
-        <w:spacing w:before="0" w:after="40" w:line="200" w:lineRule="auto"/>
+        <w:spacing w:before="0" w:after="20" w:line="200" w:lineRule="auto"/>
+        <w:jc w:val="both"/>
       </w:pPr>
     </w:pPrDefault>
   </w:docDefaults>
@@ -506,7 +508,6 @@
     <w:link w:val="BodyTextChar"/>
     <w:qFormat/>
     <w:pPr>
-      <w:spacing w:before="0" w:after="40" w:line="200" w:lineRule="auto"/>
       <w:spacing w:before="180" w:after="180"/>
     </w:pPr>
   </w:style>
@@ -521,6 +522,7 @@
     <w:basedOn w:val="BodyText"/>
     <w:qFormat/>
     <w:pPr>
+      <w:jc w:val="left"/>
       <w:spacing w:before="36" w:after="36"/>
     </w:pPr>
   </w:style>
@@ -666,13 +668,17 @@
     <w:qFormat/>
     <w:rsid w:val="00A10FD9"/>
     <w:pPr>
-      <w:spacing w:before="80" w:after="20" w:line="200" w:lineRule="auto"/>
+      <w:spacing w:before="70" w:after="10" w:line="200" w:lineRule="auto"/>
+      <w:jc w:val="left"/>
       <w:keepNext/>
       <w:keepLines/>
       <w:spacing w:before="360" w:after="80"/>
       <w:outlineLvl w:val="0"/>
     </w:pPr>
     <w:rPr>
+      <w:color w:val="2E6DA4"/>
+      <w:sz w:val="26"/>
+      <w:szCs w:val="26"/>
       <w:rFonts w:asciiTheme="majorHAnsi" w:eastAsiaTheme="majorEastAsia" w:hAnsiTheme="majorHAnsi" w:cstheme="majorBidi"/>
       <w:color w:val="0F4761" w:themeColor="accent1" w:themeShade="BF"/>
       <w:sz w:val="40"/>
@@ -690,13 +696,17 @@
     <w:qFormat/>
     <w:rsid w:val="00A10FD9"/>
     <w:pPr>
-      <w:spacing w:before="80" w:after="20" w:line="200" w:lineRule="auto"/>
+      <w:spacing w:before="70" w:after="10" w:line="200" w:lineRule="auto"/>
+      <w:jc w:val="left"/>
       <w:keepNext/>
       <w:keepLines/>
       <w:spacing w:before="160" w:after="80"/>
       <w:outlineLvl w:val="1"/>
     </w:pPr>
     <w:rPr>
+      <w:color w:val="2E6DA4"/>
+      <w:sz w:val="22"/>
+      <w:szCs w:val="22"/>
       <w:rFonts w:asciiTheme="majorHAnsi" w:eastAsiaTheme="majorEastAsia" w:hAnsiTheme="majorHAnsi" w:cstheme="majorBidi"/>
       <w:color w:val="0F4761" w:themeColor="accent1" w:themeShade="BF"/>
       <w:sz w:val="32"/>
@@ -714,13 +724,17 @@
     <w:qFormat/>
     <w:rsid w:val="00A10FD9"/>
     <w:pPr>
-      <w:spacing w:before="80" w:after="20" w:line="200" w:lineRule="auto"/>
+      <w:spacing w:before="70" w:after="10" w:line="200" w:lineRule="auto"/>
+      <w:jc w:val="left"/>
       <w:keepNext/>
       <w:keepLines/>
       <w:spacing w:before="160" w:after="80"/>
       <w:outlineLvl w:val="2"/>
     </w:pPr>
     <w:rPr>
+      <w:color w:val="2E6DA4"/>
+      <w:sz w:val="20"/>
+      <w:szCs w:val="20"/>
       <w:rFonts w:eastAsiaTheme="majorEastAsia" w:cstheme="majorBidi"/>
       <w:color w:val="0F4761" w:themeColor="accent1" w:themeShade="BF"/>
       <w:sz w:val="28"/>
@@ -738,13 +752,17 @@
     <w:qFormat/>
     <w:rsid w:val="00A10FD9"/>
     <w:pPr>
-      <w:spacing w:before="80" w:after="20" w:line="200" w:lineRule="auto"/>
+      <w:spacing w:before="70" w:after="10" w:line="200" w:lineRule="auto"/>
+      <w:jc w:val="left"/>
       <w:keepNext/>
       <w:keepLines/>
       <w:spacing w:before="80" w:after="40"/>
       <w:outlineLvl w:val="3"/>
     </w:pPr>
     <w:rPr>
+      <w:color w:val="2E6DA4"/>
+      <w:sz w:val="18"/>
+      <w:szCs w:val="18"/>
       <w:rFonts w:eastAsiaTheme="majorEastAsia" w:cstheme="majorBidi"/>
       <w:i/>
       <w:iCs/>
@@ -1023,6 +1041,14 @@
     <w:unhideWhenUsed/>
     <w:qFormat/>
     <w:tblPr>
+      <w:tblBorders>
+        <w:top w:val="single" w:sz="4" w:space="0" w:color="7F7F7F"/>
+        <w:left w:val="single" w:sz="4" w:space="0" w:color="7F7F7F"/>
+        <w:bottom w:val="single" w:sz="4" w:space="0" w:color="7F7F7F"/>
+        <w:right w:val="single" w:sz="4" w:space="0" w:color="7F7F7F"/>
+        <w:insideH w:val="single" w:sz="4" w:space="0" w:color="7F7F7F"/>
+        <w:insideV w:val="single" w:sz="4" w:space="0" w:color="7F7F7F"/>
+      </w:tblBorders>
       <w:tblInd w:w="0" w:type="dxa"/>
       <w:tblCellMar>
         <w:top w:w="0" w:type="dxa"/>

</xml_diff>